<commit_message>
TMGH 15-06-2026: refresh study files (segment-specific minority, Analyst Target Price, 3-stream table); bump cache-buster v=1506b
</commit_message>
<xml_diff>
--- a/files/TMGH_Valuation_Study_15-06-2026_public.docx
+++ b/files/TMGH_Valuation_Study_15-06-2026_public.docx
@@ -2256,7 +2256,7 @@
         <w:rPr>
           <w:rFonts w:ascii="Arial" w:cs="Arial" w:eastAsia="Arial" w:hAnsi="Arial"/>
         </w:rPr>
-        <w:t xml:space="preserve">This study's risk-adjusted base, EGP 147.1, sits ~13% above EFG Hermes' EGP 130 target (Buy, 31 Aug 2025), and the difference is about the discount, not the assets. EFG reaches 130 from 0.6× forward NAV — a flat 40% discount to gross NAV (7-yr average ~45%). This study risk-weights each project by its own execution probability — a ~22% haircut to its own full-execution value (189.6 → 147.1) — and adds no further blanket holding-company discount, so its base is a clean, execution-weighted NAV. The ~EGP 17 gap to EFG is essentially the size of the holding-company/sentiment discount one chooses to apply; the market, at 95.68, is pricing more still (~35% below this study's base, ~26% below EFG). Apply a 15–40% discount to this study's base and the range is ~EGP 88–125, which brackets both EFG and the market.</w:t>
+        <w:t xml:space="preserve">This study's risk-adjusted base, EGP 147.1, sits ~13% above the Analyst Target Price of EGP 130 (Buy, 31 Aug 2025), and the difference is about the discount, not the assets. The analyst reaches 130 from 0.6× forward NAV — a flat 40% discount to gross NAV (7-yr average ~45%). This study risk-weights each project by its own execution probability — a ~22% haircut to its own full-execution value (189.6 → 147.1) — and adds no further blanket holding-company discount, so its base is a clean, execution-weighted NAV. The ~EGP 17 gap to the Analyst Target Price is essentially the size of the holding-company/sentiment discount one chooses to apply; the market, at 95.68, is pricing more still (~35% below this study's base, ~26% below the analyst target). Apply a 15–40% discount to this study's base and the range is ~EGP 88–125, which brackets both the Analyst Target Price and the market.</w:t>
       </w:r>
     </w:p>
     <w:p>
@@ -2269,7 +2269,7 @@
           <wp:inline distT="0" distB="0" distL="0" distR="0">
             <wp:extent cx="5715000" cy="2686050"/>
             <wp:effectExtent t="0" r="0" b="0" l="0"/>
-            <wp:docPr id="1" name="chart" descr="Figure 1. Valuation football field, grouped by source. THIS STUDY: base 147.1 (risk-adjusted, dark) inside its bear-to-full-execution range of 83.6–189.6; full execution 189.6. STREET: EFG Hermes TP 130 (Buy, 31 Aug 2025 — the most recent bulge-bracket note, dated). MARKET: the trading range (Oct'25–Jun'26, 55.8–101.4) and spot 95.68 (dashed), both taken from the attached price history. At spot the market pays for the contracted business, segments and net cash plus little pipeline execution. Every bar is defined, with its source, in the table below." title="chart"/>
+            <wp:docPr id="1" name="chart" descr="Figure 1. Valuation football field, grouped by source. THIS STUDY: base 147.1 (risk-adjusted, dark) inside its bear-to-full-execution range of 83.6–189.6; full execution 189.6. STREET: Analyst Target Price 130 (Buy, 31 Aug 2025 — the most recent street note, dated). MARKET: the trading range (Oct'25–Jun'26, 55.8–101.4) and spot 95.68 (dashed), both taken from the attached price history. At spot the market pays for the contracted business, segments and net cash plus little pipeline execution. Every bar is defined, with its source, in the table below." title="chart"/>
             <wp:cNvGraphicFramePr>
               <a:graphicFrameLocks xmlns:a="http://schemas.openxmlformats.org/drawingml/2006/main" noChangeAspect="1"/>
             </wp:cNvGraphicFramePr>
@@ -2319,7 +2319,7 @@
           <w:sz w:val="14"/>
           <w:szCs w:val="14"/>
         </w:rPr>
-        <w:t xml:space="preserve">Figure 1. Valuation football field, grouped by source. THIS STUDY: base 147.1 (risk-adjusted, dark) inside its bear-to-full-execution range of 83.6–189.6; full execution 189.6. STREET: EFG Hermes TP 130 (Buy, 31 Aug 2025 — the most recent bulge-bracket note, dated). MARKET: the trading range (Oct'25–Jun'26, 55.8–101.4) and spot 95.68 (dashed), both taken from the attached price history. At spot the market pays for the contracted business, segments and net cash plus little pipeline execution. Every bar is defined, with its source, in the table below.</w:t>
+        <w:t xml:space="preserve">Figure 1. Valuation football field, grouped by source. THIS STUDY: base 147.1 (risk-adjusted, dark) inside its bear-to-full-execution range of 83.6–189.6; full execution 189.6. STREET: Analyst Target Price 130 (Buy, 31 Aug 2025 — the most recent street note, dated). MARKET: the trading range (Oct'25–Jun'26, 55.8–101.4) and spot 95.68 (dashed), both taken from the attached price history. At spot the market pays for the contracted business, segments and net cash plus little pipeline execution. Every bar is defined, with its source, in the table below.</w:t>
       </w:r>
     </w:p>
     <w:p>
@@ -4087,7 +4087,7 @@
                 <w:sz w:val="16"/>
                 <w:szCs w:val="16"/>
               </w:rPr>
-              <w:t xml:space="preserve">EFG Hermes target</w:t>
+              <w:t xml:space="preserve">Analyst Target Price</w:t>
             </w:r>
           </w:p>
         </w:tc>
@@ -4157,7 +4157,7 @@
                 <w:sz w:val="16"/>
                 <w:szCs w:val="16"/>
               </w:rPr>
-              <w:t xml:space="preserve">STREET. EFG Hermes, Buy, 31 Aug 2025 (Mai Attia), 0.6× forward NAV (40% discount). Most recent bulge-bracket note; dated, shown for cross-check only.</w:t>
+              <w:t xml:space="preserve">STREET. Analyst target, Buy, 31 Aug 2025, 0.6× forward NAV (40% discount). Most recent street note; dated, shown for cross-check only.</w:t>
             </w:r>
           </w:p>
         </w:tc>
@@ -8957,7 +8957,7 @@
         <w:rPr>
           <w:rFonts w:ascii="Arial" w:cs="Arial" w:eastAsia="Arial" w:hAnsi="Arial"/>
         </w:rPr>
-        <w:t xml:space="preserve">the three lenses tell one story on different clocks — the near-term tape has turned back up with volume confirmation, the three-month distribution skews right on launch execution and tourism, and the fundamental value sits ~54% above price with a floor only ~13% below it. That ~54% is the undiscounted, execution-weighted asset value: the gap to EFG's EGP 130 and to the market is essentially the holding-company/NAV discount each chooses to apply (EFG 40%, the market more), not a disagreement on the assets. Below ~83.6 the market would be pricing less than even the contracted-plus-cash construction. The fundamental upside and the technical recovery are aligned; the Monte Carlo simply says the next month is two-sided while the quarter pays. What, if anything, follows for any individual depends on circumstances this study does not know and does not address.</w:t>
+        <w:t xml:space="preserve">the three lenses tell one story on different clocks — the near-term tape has turned back up with volume confirmation, the three-month distribution skews right on launch execution and tourism, and the fundamental value sits ~54% above price with a floor only ~13% below it. That ~54% is the undiscounted, execution-weighted asset value: the gap to the EGP 130 Analyst Target Price and to the market is essentially the holding-company/NAV discount each chooses to apply (the analyst 40%, the market more), not a disagreement on the assets. Below ~83.6 the market would be pricing less than even the contracted-plus-cash construction. The fundamental upside and the technical recovery are aligned; the Monte Carlo simply says the next month is two-sided while the quarter pays. What, if anything, follows for any individual depends on circumstances this study does not know and does not address.</w:t>
       </w:r>
     </w:p>
     <w:p>
@@ -10090,7 +10090,7 @@
         <w:rPr>
           <w:rFonts w:ascii="Arial" w:cs="Arial" w:eastAsia="Arial" w:hAnsi="Arial"/>
         </w:rPr>
-        <w:t xml:space="preserve">The discrete event factors (launch p = 55%, cross-border p = 30%) place most of the right tail here; 24%/58% of paths touch 110 and 8%/39% touch 118 (T+20/T+60), with 2%/24% reaching the 126 level — around EFG's EGP 130 target and near the top of where the three-month cone realistically reaches.</w:t>
+        <w:t xml:space="preserve">The discrete event factors (launch p = 55%, cross-border p = 30%) place most of the right tail here; 24%/58% of paths touch 110 and 8%/39% touch 118 (T+20/T+60), with 2%/24% reaching the 126 level — around the EGP 130 Analyst Target Price and near the top of where the three-month cone realistically reaches.</w:t>
       </w:r>
     </w:p>
     <w:p>
@@ -10108,13 +10108,13 @@
           <w:b/>
           <w:bCs/>
         </w:rPr>
-        <w:t xml:space="preserve">128–137 — EFG's target / cone-ceiling zone. </w:t>
-      </w:r>
-      <w:r>
-        <w:rPr>
-          <w:rFonts w:ascii="Arial" w:cs="Arial" w:eastAsia="Arial" w:hAnsi="Arial"/>
-        </w:rPr>
-        <w:t xml:space="preserve">EFG's EGP 130 target sits here, as does the 137 level that only 0%/12% of paths touch (T+20/T+60) — effectively the ceiling of the three-month distribution. This study's risk-adjusted base, EGP 147.1, sits above this band entirely: it is an undiscounted, execution-weighted NAV, and the cone reaches it only beyond three months and only on strong execution together with a narrowing of the holding-company discount the market currently applies.</w:t>
+        <w:t xml:space="preserve">128–137 — Analyst-target / cone-ceiling zone. </w:t>
+      </w:r>
+      <w:r>
+        <w:rPr>
+          <w:rFonts w:ascii="Arial" w:cs="Arial" w:eastAsia="Arial" w:hAnsi="Arial"/>
+        </w:rPr>
+        <w:t xml:space="preserve">The Analyst Target Price of EGP 130 sits here, as does the 137 level that only 0%/12% of paths touch (T+20/T+60) — effectively the ceiling of the three-month distribution. This study's risk-adjusted base, EGP 147.1, sits above this band entirely: it is an undiscounted, execution-weighted NAV, and the cone reaches it only beyond three months and only on strong execution together with a narrowing of the holding-company discount the market currently applies.</w:t>
       </w:r>
     </w:p>
     <w:p>
@@ -10182,7 +10182,7 @@
         <w:rPr>
           <w:rFonts w:ascii="Arial" w:cs="Arial" w:eastAsia="Arial" w:hAnsi="Arial"/>
         </w:rPr>
-        <w:t xml:space="preserve">Minority is deducted segment-by-segment from actual ownership: 40.5% on the hotels (the ADQ/ADNEC stake in ICON — the only large, hard number), a contribution-weighted ~10% on the consolidated backlog (each JV at its actual partner share — Banan 49%, Oman 40%, Iraq 50% — weighted by its share of the book), and nil on the ~99.99%-owned Egyptian development and recurring and on the cross-border JV projects, which are already carried at TMG's economic share, so re-deducting would double-count. On the backlog the partner shares are known; the only soft input is the EGP split of the EGP 457.9bn book (Banan ≈79bn, Oman ≈16bn, Iraq ~nil), and a wide ±10pp swing in it moves the base by only ~±EGP 1.5/share. The larger judgment is that this study applies no blanket holding-company/NAV discount, so the EGP 147.1 base is a clean execution-weighted NAV; EFG layers a 40% discount to reach 130 and the market prices more. A 15–40% holding-company discount on this study's base gives ~EGP 88–125, bracketing EFG and the market — so the +54% is the undiscounted asset value, not an entry signal. The audited FY2025 segment notes (ownership of each development entity and the backlog split) would tighten both the minority and the discount.</w:t>
+        <w:t xml:space="preserve">Minority is deducted segment-by-segment from actual ownership: 40.5% on the hotels (the ADQ/ADNEC stake in ICON — the only large, hard number), a contribution-weighted ~10% on the consolidated backlog (each JV at its actual partner share — Banan 49%, Oman 40%, Iraq 50% — weighted by its share of the book), and nil on the ~99.99%-owned Egyptian development and recurring and on the cross-border JV projects, which are already carried at TMG's economic share, so re-deducting would double-count. On the backlog the partner shares are known; the only soft input is the EGP split of the EGP 457.9bn book (Banan ≈79bn, Oman ≈16bn, Iraq ~nil), and a wide ±10pp swing in it moves the base by only ~±EGP 1.5/share. The larger judgment is that this study applies no blanket holding-company/NAV discount, so the EGP 147.1 base is a clean execution-weighted NAV; the analyst layers a 40% discount to reach 130 and the market prices more. A 15–40% holding-company discount on this study's base gives ~EGP 88–125, bracketing the Analyst Target Price and the market — so the +54% is the undiscounted asset value, not an entry signal. The audited FY2025 segment notes (ownership of each development entity and the backlog split) would tighten both the minority and the discount.</w:t>
       </w:r>
     </w:p>
     <w:p>

</xml_diff>